<commit_message>
docs: remover menções a branch techchalleng3 (usar apenas main)
</commit_message>
<xml_diff>
--- a/docs/RELATORIO_TECNICO_PARA_EQUIPE.docx
+++ b/docs/RELATORIO_TECNICO_PARA_EQUIPE.docx
@@ -322,7 +322,7 @@
           <w:rFonts w:ascii="Consolas" w:hAnsi="Consolas"/>
           <w:sz w:val="20"/>
         </w:rPr>
-        <w:t>techchalleng3</w:t>
+        <w:t>main</w:t>
       </w:r>
       <w:r>
         <w:t>)</w:t>
@@ -13636,7 +13636,7 @@
           <w:rFonts w:ascii="Consolas" w:hAnsi="Consolas"/>
           <w:sz w:val="20"/>
         </w:rPr>
-        <w:t>techchalleng3</w:t>
+        <w:t>main</w:t>
       </w:r>
     </w:p>
     <w:p>

</xml_diff>